<commit_message>
docs: embed high-resolution architecture diagram image into submission word document
</commit_message>
<xml_diff>
--- a/docs/oss_report/2026 오픈소스 개발자대회 결과보고서_484.docx
+++ b/docs/oss_report/2026 오픈소스 개발자대회 결과보고서_484.docx
@@ -2902,381 +2902,47 @@
                 <w:color w:val="1E293B"/>
                 <w:sz w:val="17"/>
               </w:rPr>
-              <w:t>• Presentation Layer: HTML5/Vanilla CSS/WebSocket JSON-RPC 기반 실시간 대화 웹 대시보드(Port 7860) &amp; MJPEG 비전 스트리밍.</w:t>
-            </w:r>
-          </w:p>
-          <w:p>
-            <w:pPr>
-              <w:spacing w:line="276" w:lineRule="auto" w:before="20" w:after="20"/>
-              <w:jc w:val="left"/>
-            </w:pPr>
-            <w:r>
-              <w:rPr>
-                <w:rFonts w:ascii="맑은 고딕" w:hAnsi="맑은 고딕"/>
-                <w:b w:val="0"/>
-                <w:color w:val="1E293B"/>
-                <w:sz w:val="17"/>
-              </w:rPr>
-            </w:r>
-          </w:p>
-          <w:p>
-            <w:pPr>
-              <w:spacing w:line="276" w:lineRule="auto" w:before="20" w:after="20"/>
-              <w:jc w:val="left"/>
-            </w:pPr>
-            <w:r>
-              <w:rPr>
-                <w:rFonts w:ascii="맑은 고딕" w:hAnsi="맑은 고딕"/>
-                <w:b w:val="0"/>
-                <w:color w:val="1E293B"/>
-                <w:sz w:val="17"/>
-              </w:rPr>
-              <w:t>[5계층 상호작용 아키텍처 다이어그램]</w:t>
-            </w:r>
-          </w:p>
-          <w:p>
-            <w:pPr>
-              <w:spacing w:line="276" w:lineRule="auto" w:before="20" w:after="20"/>
-              <w:jc w:val="left"/>
-            </w:pPr>
-            <w:r>
-              <w:rPr>
-                <w:rFonts w:ascii="맑은 고딕" w:hAnsi="맑은 고딕"/>
-                <w:b w:val="0"/>
-                <w:color w:val="1E293B"/>
-                <w:sz w:val="17"/>
-              </w:rPr>
-              <w:t>[사용자 음성 / 시각 / 환경 정보]</w:t>
-            </w:r>
-          </w:p>
-          <w:p>
-            <w:pPr>
-              <w:spacing w:line="276" w:lineRule="auto" w:before="20" w:after="20"/>
-              <w:jc w:val="left"/>
-            </w:pPr>
-            <w:r>
-              <w:rPr>
-                <w:rFonts w:ascii="맑은 고딕" w:hAnsi="맑은 고딕"/>
-                <w:b w:val="0"/>
-                <w:color w:val="1E293B"/>
-                <w:sz w:val="17"/>
-              </w:rPr>
-              <w:t xml:space="preserve">      │ (오디오/비전 입력)</w:t>
-            </w:r>
-          </w:p>
-          <w:p>
-            <w:pPr>
-              <w:spacing w:line="276" w:lineRule="auto" w:before="20" w:after="20"/>
-              <w:jc w:val="left"/>
-            </w:pPr>
-            <w:r>
-              <w:rPr>
-                <w:rFonts w:ascii="맑은 고딕" w:hAnsi="맑은 고딕"/>
-                <w:b w:val="0"/>
-                <w:color w:val="1E293B"/>
-                <w:sz w:val="17"/>
-              </w:rPr>
-              <w:t xml:space="preserve">      ▼</w:t>
-            </w:r>
-          </w:p>
-          <w:p>
-            <w:pPr>
-              <w:spacing w:line="276" w:lineRule="auto" w:before="20" w:after="20"/>
-              <w:jc w:val="left"/>
-            </w:pPr>
-            <w:r>
-              <w:rPr>
-                <w:rFonts w:ascii="맑은 고딕" w:hAnsi="맑은 고딕"/>
-                <w:b w:val="0"/>
-                <w:color w:val="1E293B"/>
-                <w:sz w:val="17"/>
-              </w:rPr>
-              <w:t>┌────────────────────────────────────────────────────────┐</w:t>
-            </w:r>
-          </w:p>
-          <w:p>
-            <w:pPr>
-              <w:spacing w:line="276" w:lineRule="auto" w:before="20" w:after="20"/>
-              <w:jc w:val="left"/>
-            </w:pPr>
-            <w:r>
-              <w:rPr>
-                <w:rFonts w:ascii="맑은 고딕" w:hAnsi="맑은 고딕"/>
-                <w:b w:val="0"/>
-                <w:color w:val="1E293B"/>
-                <w:sz w:val="17"/>
-              </w:rPr>
-              <w:t>│                Reachy Mini Robot Daemon                │</w:t>
-            </w:r>
-          </w:p>
-          <w:p>
-            <w:pPr>
-              <w:spacing w:line="276" w:lineRule="auto" w:before="20" w:after="20"/>
-              <w:jc w:val="left"/>
-            </w:pPr>
-            <w:r>
-              <w:rPr>
-                <w:rFonts w:ascii="맑은 고딕" w:hAnsi="맑은 고딕"/>
-                <w:b w:val="0"/>
-                <w:color w:val="1E293B"/>
-                <w:sz w:val="17"/>
-              </w:rPr>
-              <w:t>│   • XVF3800 DoA 음원 방향 추적   • GStreamer 미디어      │</w:t>
-            </w:r>
-          </w:p>
-          <w:p>
-            <w:pPr>
-              <w:spacing w:line="276" w:lineRule="auto" w:before="20" w:after="20"/>
-              <w:jc w:val="left"/>
-            </w:pPr>
-            <w:r>
-              <w:rPr>
-                <w:rFonts w:ascii="맑은 고딕" w:hAnsi="맑은 고딕"/>
-                <w:b w:val="0"/>
-                <w:color w:val="1E293B"/>
-                <w:sz w:val="17"/>
-              </w:rPr>
-              <w:t>│   • 6-DOF Stewart 기구학         • 2-DOF 안테나 제스처    │</w:t>
-            </w:r>
-          </w:p>
-          <w:p>
-            <w:pPr>
-              <w:spacing w:line="276" w:lineRule="auto" w:before="20" w:after="20"/>
-              <w:jc w:val="left"/>
-            </w:pPr>
-            <w:r>
-              <w:rPr>
-                <w:rFonts w:ascii="맑은 고딕" w:hAnsi="맑은 고딕"/>
-                <w:b w:val="0"/>
-                <w:color w:val="1E293B"/>
-                <w:sz w:val="17"/>
-              </w:rPr>
-              <w:t>└────────────────────────────────────────────────────────┘</w:t>
-            </w:r>
-          </w:p>
-          <w:p>
-            <w:pPr>
-              <w:spacing w:line="276" w:lineRule="auto" w:before="20" w:after="20"/>
-              <w:jc w:val="left"/>
-            </w:pPr>
-            <w:r>
-              <w:rPr>
-                <w:rFonts w:ascii="맑은 고딕" w:hAnsi="맑은 고딕"/>
-                <w:b w:val="0"/>
-                <w:color w:val="1E293B"/>
-                <w:sz w:val="17"/>
-              </w:rPr>
-              <w:t xml:space="preserve">      ▲ (REST / WebSocket IPC 통신)</w:t>
-            </w:r>
-          </w:p>
-          <w:p>
-            <w:pPr>
-              <w:spacing w:line="276" w:lineRule="auto" w:before="20" w:after="20"/>
-              <w:jc w:val="left"/>
-            </w:pPr>
-            <w:r>
-              <w:rPr>
-                <w:rFonts w:ascii="맑은 고딕" w:hAnsi="맑은 고딕"/>
-                <w:b w:val="0"/>
-                <w:color w:val="1E293B"/>
-                <w:sz w:val="17"/>
-              </w:rPr>
-              <w:t xml:space="preserve">      ▼</w:t>
-            </w:r>
-          </w:p>
-          <w:p>
-            <w:pPr>
-              <w:spacing w:line="276" w:lineRule="auto" w:before="20" w:after="20"/>
-              <w:jc w:val="left"/>
-            </w:pPr>
-            <w:r>
-              <w:rPr>
-                <w:rFonts w:ascii="맑은 고딕" w:hAnsi="맑은 고딕"/>
-                <w:b w:val="0"/>
-                <w:color w:val="1E293B"/>
-                <w:sz w:val="17"/>
-              </w:rPr>
-              <w:t>┌────────────────────────────────────────────────────────┐</w:t>
-            </w:r>
-          </w:p>
-          <w:p>
-            <w:pPr>
-              <w:spacing w:line="276" w:lineRule="auto" w:before="20" w:after="20"/>
-              <w:jc w:val="left"/>
-            </w:pPr>
-            <w:r>
-              <w:rPr>
-                <w:rFonts w:ascii="맑은 고딕" w:hAnsi="맑은 고딕"/>
-                <w:b w:val="0"/>
-                <w:color w:val="1E293B"/>
-                <w:sz w:val="17"/>
-              </w:rPr>
-              <w:t>│         DeskMate Conversation Core Application         │</w:t>
-            </w:r>
-          </w:p>
-          <w:p>
-            <w:pPr>
-              <w:spacing w:line="276" w:lineRule="auto" w:before="20" w:after="20"/>
-              <w:jc w:val="left"/>
-            </w:pPr>
-            <w:r>
-              <w:rPr>
-                <w:rFonts w:ascii="맑은 고딕" w:hAnsi="맑은 고딕"/>
-                <w:b w:val="0"/>
-                <w:color w:val="1E293B"/>
-                <w:sz w:val="17"/>
-              </w:rPr>
-              <w:t>│  • OpenAIRealtimeHandler (24kHz 실시간 오디오/Server VAD)│</w:t>
-            </w:r>
-          </w:p>
-          <w:p>
-            <w:pPr>
-              <w:spacing w:line="276" w:lineRule="auto" w:before="20" w:after="20"/>
-              <w:jc w:val="left"/>
-            </w:pPr>
-            <w:r>
-              <w:rPr>
-                <w:rFonts w:ascii="맑은 고딕" w:hAnsi="맑은 고딕"/>
-                <w:b w:val="0"/>
-                <w:color w:val="1E293B"/>
-                <w:sz w:val="17"/>
-              </w:rPr>
-              <w:t>│  • Face3DDetector (YuNet ONNX) &amp; YOLOv8 사물 감지      │</w:t>
-            </w:r>
-          </w:p>
-          <w:p>
-            <w:pPr>
-              <w:spacing w:line="276" w:lineRule="auto" w:before="20" w:after="20"/>
-              <w:jc w:val="left"/>
-            </w:pPr>
-            <w:r>
-              <w:rPr>
-                <w:rFonts w:ascii="맑은 고딕" w:hAnsi="맑은 고딕"/>
-                <w:b w:val="0"/>
-                <w:color w:val="1E293B"/>
-                <w:sz w:val="17"/>
-              </w:rPr>
-              <w:t>│  • Google Calendar OAuth &amp; 5대 기본 스케줄 서비스       │</w:t>
-            </w:r>
-          </w:p>
-          <w:p>
-            <w:pPr>
-              <w:spacing w:line="276" w:lineRule="auto" w:before="20" w:after="20"/>
-              <w:jc w:val="left"/>
-            </w:pPr>
-            <w:r>
-              <w:rPr>
-                <w:rFonts w:ascii="맑은 고딕" w:hAnsi="맑은 고딕"/>
-                <w:b w:val="0"/>
-                <w:color w:val="1E293B"/>
-                <w:sz w:val="17"/>
-              </w:rPr>
-              <w:t>│  • Pomodoro 타이머 및 생산성 도구셋                      │</w:t>
-            </w:r>
-          </w:p>
-          <w:p>
-            <w:pPr>
-              <w:spacing w:line="276" w:lineRule="auto" w:before="20" w:after="20"/>
-              <w:jc w:val="left"/>
-            </w:pPr>
-            <w:r>
-              <w:rPr>
-                <w:rFonts w:ascii="맑은 고딕" w:hAnsi="맑은 고딕"/>
-                <w:b w:val="0"/>
-                <w:color w:val="1E293B"/>
-                <w:sz w:val="17"/>
-              </w:rPr>
-              <w:t>│  • Standby / Wake Loop (호출어: '리치야', '일어나')       │</w:t>
-            </w:r>
-          </w:p>
-          <w:p>
-            <w:pPr>
-              <w:spacing w:line="276" w:lineRule="auto" w:before="20" w:after="20"/>
-              <w:jc w:val="left"/>
-            </w:pPr>
-            <w:r>
-              <w:rPr>
-                <w:rFonts w:ascii="맑은 고딕" w:hAnsi="맑은 고딕"/>
-                <w:b w:val="0"/>
-                <w:color w:val="1E293B"/>
-                <w:sz w:val="17"/>
-              </w:rPr>
-              <w:t>└────────────────────────────────────────────────────────┘</w:t>
-            </w:r>
-          </w:p>
-          <w:p>
-            <w:pPr>
-              <w:spacing w:line="276" w:lineRule="auto" w:before="20" w:after="20"/>
-              <w:jc w:val="left"/>
-            </w:pPr>
-            <w:r>
-              <w:rPr>
-                <w:rFonts w:ascii="맑은 고딕" w:hAnsi="맑은 고딕"/>
-                <w:b w:val="0"/>
-                <w:color w:val="1E293B"/>
-                <w:sz w:val="17"/>
-              </w:rPr>
-              <w:t xml:space="preserve">      ▲ (WebSocket JSON-RPC)</w:t>
-            </w:r>
-          </w:p>
-          <w:p>
-            <w:pPr>
-              <w:spacing w:line="276" w:lineRule="auto" w:before="20" w:after="20"/>
-              <w:jc w:val="left"/>
-            </w:pPr>
-            <w:r>
-              <w:rPr>
-                <w:rFonts w:ascii="맑은 고딕" w:hAnsi="맑은 고딕"/>
-                <w:b w:val="0"/>
-                <w:color w:val="1E293B"/>
-                <w:sz w:val="17"/>
-              </w:rPr>
-              <w:t xml:space="preserve">      ▼</w:t>
-            </w:r>
-          </w:p>
-          <w:p>
-            <w:pPr>
-              <w:spacing w:line="276" w:lineRule="auto" w:before="20" w:after="20"/>
-              <w:jc w:val="left"/>
-            </w:pPr>
-            <w:r>
-              <w:rPr>
-                <w:rFonts w:ascii="맑은 고딕" w:hAnsi="맑은 고딕"/>
-                <w:b w:val="0"/>
-                <w:color w:val="1E293B"/>
-                <w:sz w:val="17"/>
-              </w:rPr>
-              <w:t>┌────────────────────────────────────────────────────────┐</w:t>
-            </w:r>
-          </w:p>
-          <w:p>
-            <w:pPr>
-              <w:spacing w:line="276" w:lineRule="auto" w:before="20" w:after="20"/>
-              <w:jc w:val="left"/>
-            </w:pPr>
-            <w:r>
-              <w:rPr>
-                <w:rFonts w:ascii="맑은 고딕" w:hAnsi="맑은 고딕"/>
-                <w:b w:val="0"/>
-                <w:color w:val="1E293B"/>
-                <w:sz w:val="17"/>
-              </w:rPr>
-              <w:t>│     Web Dashboard (Port 7860) &amp; MuJoCo 3D Simulator    │</w:t>
-            </w:r>
-          </w:p>
-          <w:p>
-            <w:pPr>
-              <w:spacing w:line="276" w:lineRule="auto" w:before="20" w:after="20"/>
-              <w:jc w:val="left"/>
-            </w:pPr>
-            <w:r>
-              <w:rPr>
-                <w:rFonts w:ascii="맑은 고딕" w:hAnsi="맑은 고딕"/>
-                <w:b w:val="0"/>
-                <w:color w:val="1E293B"/>
-                <w:sz w:val="17"/>
-              </w:rPr>
-              <w:t>└────────────────────────────────────────────────────────┘</w:t>
+              <w:t>• Presentation Layer: HTML5/Vanilla CSS/WebSocket JSON-RPC 기반 실시간 대화 웹 대시보드(Port 7860) &amp; MJPEG 비전 스트리밍 &amp; MuJoCo 3D 물리 시뮬레이터.</w:t>
+            </w:r>
+          </w:p>
+          <w:p>
+            <w:pPr>
+              <w:spacing w:before="120" w:after="80"/>
+              <w:jc w:val="center"/>
+            </w:pPr>
+            <w:r>
+              <w:drawing>
+                <wp:inline xmlns:a="http://schemas.openxmlformats.org/drawingml/2006/main" xmlns:pic="http://schemas.openxmlformats.org/drawingml/2006/picture">
+                  <wp:extent cx="5120640" cy="3669792"/>
+                  <wp:docPr id="1" name="Picture 1"/>
+                  <wp:cNvGraphicFramePr>
+                    <a:graphicFrameLocks noChangeAspect="1"/>
+                  </wp:cNvGraphicFramePr>
+                  <a:graphic>
+                    <a:graphicData uri="http://schemas.openxmlformats.org/drawingml/2006/picture">
+                      <pic:pic>
+                        <pic:nvPicPr>
+                          <pic:cNvPr id="0" name="architecture_diagram.png"/>
+                          <pic:cNvPicPr/>
+                        </pic:nvPicPr>
+                        <pic:blipFill>
+                          <a:blip r:embed="rId9"/>
+                          <a:stretch>
+                            <a:fillRect/>
+                          </a:stretch>
+                        </pic:blipFill>
+                        <pic:spPr>
+                          <a:xfrm>
+                            <a:off x="0" y="0"/>
+                            <a:ext cx="5120640" cy="3669792"/>
+                          </a:xfrm>
+                          <a:prstGeom prst="rect"/>
+                        </pic:spPr>
+                      </pic:pic>
+                    </a:graphicData>
+                  </a:graphic>
+                </wp:inline>
+              </w:drawing>
             </w:r>
           </w:p>
         </w:tc>

</xml_diff>